<commit_message>
Enhance resume internships and featured projects
</commit_message>
<xml_diff>
--- a/Resumes/Prasad_Pawar_AI_ML_Engineer_Resume.docx
+++ b/Resumes/Prasad_Pawar_AI_ML_Engineer_Resume.docx
@@ -273,7 +273,24 @@
           <w:rFonts w:ascii="Calibri" w:hAnsi="Calibri"/>
           <w:sz w:val="17"/>
         </w:rPr>
-        <w:t>Studied modeling ideas for generators, loads, storage devices, network constraints, optimization objectives, and review-ready technical documentation.</w:t>
+        <w:t>Studied generators, loads, storage devices, buses, links, operating constraints, objective functions, and scenario-based optimization outputs.</w:t>
+      </w:r>
+    </w:p>
+    <w:p>
+      <w:pPr>
+        <w:pStyle w:val="ResumeBullet"/>
+        <w:numPr>
+          <w:ilvl w:val="0"/>
+          <w:numId w:val="10"/>
+        </w:numPr>
+        <w:ind w:left="360" w:hanging="187"/>
+      </w:pPr>
+      <w:r>
+        <w:rPr>
+          <w:rFonts w:ascii="Calibri" w:hAnsi="Calibri"/>
+          <w:sz w:val="17"/>
+        </w:rPr>
+        <w:t>Prepared requirement-style notes and technical documentation while maintaining confidentiality around company and customer information.</w:t>
       </w:r>
     </w:p>
     <w:p>
@@ -312,7 +329,7 @@
           <w:rFonts w:ascii="Calibri" w:hAnsi="Calibri"/>
           <w:sz w:val="17"/>
         </w:rPr>
-        <w:t>Learned and practiced AI/ML workflows including Python data handling, preprocessing, feature engineering, model evaluation, and LLM concepts.</w:t>
+        <w:t>Practiced end-to-end AI/ML workflows covering data understanding, preprocessing, feature engineering, train/test evaluation, and result interpretation.</w:t>
       </w:r>
     </w:p>
     <w:p>
@@ -329,7 +346,24 @@
           <w:rFonts w:ascii="Calibri" w:hAnsi="Calibri"/>
           <w:sz w:val="17"/>
         </w:rPr>
-        <w:t>Explored practical GenAI/LLM use cases, prompt experimentation, and model-result interpretation while building stronger AI/ML fundamentals.</w:t>
+        <w:t>Explored GenAI and LLM fundamentals through prompt experimentation, use-case mapping, response review, and practical model-behavior documentation.</w:t>
+      </w:r>
+    </w:p>
+    <w:p>
+      <w:pPr>
+        <w:pStyle w:val="ResumeBullet"/>
+        <w:numPr>
+          <w:ilvl w:val="0"/>
+          <w:numId w:val="10"/>
+        </w:numPr>
+        <w:ind w:left="360" w:hanging="187"/>
+      </w:pPr>
+      <w:r>
+        <w:rPr>
+          <w:rFonts w:ascii="Calibri" w:hAnsi="Calibri"/>
+          <w:sz w:val="17"/>
+        </w:rPr>
+        <w:t>Built small Python experiments with Pandas, NumPy, and Scikit-learn while converting learning outputs into clear notes and review-ready summaries.</w:t>
       </w:r>
     </w:p>
     <w:p>
@@ -344,6 +378,62 @@
           <w:sz w:val="20"/>
         </w:rPr>
         <w:t>SELECTED PROJECTS</w:t>
+      </w:r>
+    </w:p>
+    <w:p>
+      <w:pPr>
+        <w:pStyle w:val="ResumeEntry"/>
+      </w:pPr>
+      <w:r>
+        <w:rPr>
+          <w:rFonts w:ascii="Calibri" w:hAnsi="Calibri"/>
+          <w:b/>
+          <w:sz w:val="18"/>
+        </w:rPr>
+        <w:t>NeuroDetect - Alzheimer Detection App</w:t>
+      </w:r>
+      <w:r>
+        <w:rPr>
+          <w:rFonts w:ascii="Calibri" w:hAnsi="Calibri"/>
+          <w:i/>
+          <w:color w:val="555555"/>
+          <w:sz w:val="17"/>
+        </w:rPr>
+        <w:t xml:space="preserve"> | React, TypeScript, FastAPI, SQLAlchemy, PostgreSQL, Redis, Docker</w:t>
+      </w:r>
+    </w:p>
+    <w:p>
+      <w:pPr>
+        <w:pStyle w:val="ResumeBullet"/>
+        <w:numPr>
+          <w:ilvl w:val="0"/>
+          <w:numId w:val="10"/>
+        </w:numPr>
+        <w:ind w:left="360" w:hanging="187"/>
+      </w:pPr>
+      <w:r>
+        <w:rPr>
+          <w:rFonts w:ascii="Calibri" w:hAnsi="Calibri"/>
+          <w:sz w:val="17"/>
+        </w:rPr>
+        <w:t>Built a full-stack Alzheimer detection project with MRI upload flow, CNN-based prediction pipeline, patient records, report history, and React UI workflows.</w:t>
+      </w:r>
+    </w:p>
+    <w:p>
+      <w:pPr>
+        <w:pStyle w:val="ResumeBullet"/>
+        <w:numPr>
+          <w:ilvl w:val="0"/>
+          <w:numId w:val="10"/>
+        </w:numPr>
+        <w:ind w:left="360" w:hanging="187"/>
+      </w:pPr>
+      <w:r>
+        <w:rPr>
+          <w:rFonts w:ascii="Calibri" w:hAnsi="Calibri"/>
+          <w:sz w:val="17"/>
+        </w:rPr>
+        <w:t>Designed FastAPI backend modules, relational data models, Docker Compose services, caching-ready configuration, and prediction-history endpoints.</w:t>
       </w:r>
     </w:p>
     <w:p>
@@ -382,7 +472,7 @@
           <w:rFonts w:ascii="Calibri" w:hAnsi="Calibri"/>
           <w:sz w:val="17"/>
         </w:rPr>
-        <w:t>Built a PDF/TXT ingestion and retrieval system with chunk metadata, page tracking, confidence scoring, and citation validation.</w:t>
+        <w:t>Built a citation-backed RAG system for research-paper Q&amp;A with PDF/TXT ingestion, chunk metadata, page tracking, confidence scoring, and answer validation.</w:t>
       </w:r>
     </w:p>
     <w:p>
@@ -399,7 +489,7 @@
           <w:rFonts w:ascii="Calibri" w:hAnsi="Calibri"/>
           <w:sz w:val="17"/>
         </w:rPr>
-        <w:t>Implemented FastAPI endpoints, Streamlit diagnostics, timeout handling, weak-evidence flags, and fallback behavior for reviewable answers.</w:t>
+        <w:t>Implemented FastAPI services and Streamlit review screens with weak-evidence flags, timeout handling, fallback behavior, and reviewer-friendly diagnostics.</w:t>
       </w:r>
     </w:p>
     <w:p>
@@ -412,7 +502,7 @@
           <w:b/>
           <w:sz w:val="18"/>
         </w:rPr>
-        <w:t>NeuroDetect - Alzheimer Detection App</w:t>
+        <w:t>Result Hub Excel Add-in</w:t>
       </w:r>
       <w:r>
         <w:rPr>
@@ -421,7 +511,7 @@
           <w:color w:val="555555"/>
           <w:sz w:val="17"/>
         </w:rPr>
-        <w:t xml:space="preserve"> | React, TypeScript, FastAPI, SQLAlchemy, PostgreSQL, Redis, Docker</w:t>
+        <w:t xml:space="preserve"> | VBA, Excel Automation, Python, Pandas, Dashboard Reporting</w:t>
       </w:r>
     </w:p>
     <w:p>
@@ -438,7 +528,7 @@
           <w:rFonts w:ascii="Calibri" w:hAnsi="Calibri"/>
           <w:sz w:val="17"/>
         </w:rPr>
-        <w:t>Built a full-stack AI screening project with MRI upload UI, risk survey flow, report history, and prediction-history workflows.</w:t>
+        <w:t>Created an Excel-based academic result automation workflow with setup forms, template generation, import normalization, validation logs, and dashboards.</w:t>
       </w:r>
     </w:p>
     <w:p>
@@ -455,7 +545,7 @@
           <w:rFonts w:ascii="Calibri" w:hAnsi="Calibri"/>
           <w:sz w:val="17"/>
         </w:rPr>
-        <w:t>Designed backend APIs, relational models, caching-ready configuration, object-storage-ready settings, and Docker Compose services.</w:t>
+        <w:t>Automated course outcome, faculty, class, topper, ATKT, pass/fail, and learning-gap reports to reduce manual review effort and improve repeatability.</w:t>
       </w:r>
     </w:p>
     <w:p>
@@ -468,7 +558,7 @@
           <w:b/>
           <w:sz w:val="18"/>
         </w:rPr>
-        <w:t>Credit Card Fraud Detection</w:t>
+        <w:t>Blood Bank / Donation Management System</w:t>
       </w:r>
       <w:r>
         <w:rPr>
@@ -477,7 +567,7 @@
           <w:color w:val="555555"/>
           <w:sz w:val="17"/>
         </w:rPr>
-        <w:t xml:space="preserve"> | Python, Pandas, NumPy, Scikit-learn, SMOTE, Jupyter</w:t>
+        <w:t xml:space="preserve"> | Python, Django, SQLite, HTML/CSS, Bootstrap-style Templates</w:t>
       </w:r>
     </w:p>
     <w:p>
@@ -494,7 +584,7 @@
           <w:rFonts w:ascii="Calibri" w:hAnsi="Calibri"/>
           <w:sz w:val="17"/>
         </w:rPr>
-        <w:t>Built an imbalanced-classification workflow with preprocessing, oversampling, model comparison, and confusion matrices.</w:t>
+        <w:t>Worked with a Django web application for donor, patient, blood donation, blood request, stock, and admin approval workflows.</w:t>
       </w:r>
     </w:p>
     <w:p>
@@ -511,7 +601,7 @@
           <w:rFonts w:ascii="Calibri" w:hAnsi="Calibri"/>
           <w:sz w:val="17"/>
         </w:rPr>
-        <w:t>Evaluated ROC/PR curves and F1 score results to compare model quality and document findings clearly.</w:t>
+        <w:t>Organized local setup, SQLite-backed data flow, demo admin records, screenshots, and README documentation for a recruiter-friendly portfolio project.</w:t>
       </w:r>
     </w:p>
     <w:p>
@@ -524,7 +614,7 @@
           <w:b/>
           <w:sz w:val="18"/>
         </w:rPr>
-        <w:t>Diabetes Prediction</w:t>
+        <w:t>Daily Diary Frontend App</w:t>
       </w:r>
       <w:r>
         <w:rPr>
@@ -533,7 +623,7 @@
           <w:color w:val="555555"/>
           <w:sz w:val="17"/>
         </w:rPr>
-        <w:t xml:space="preserve"> | Python, Pandas, NumPy, Scikit-learn, Jupyter</w:t>
+        <w:t xml:space="preserve"> | HTML5, CSS3, JavaScript, Bootstrap</w:t>
       </w:r>
     </w:p>
     <w:p>
@@ -550,7 +640,7 @@
           <w:rFonts w:ascii="Calibri" w:hAnsi="Calibri"/>
           <w:sz w:val="17"/>
         </w:rPr>
-        <w:t>Built a supervised ML notebook for diabetes prediction using preprocessing, feature handling, and classification algorithms.</w:t>
+        <w:t>Built a polished responsive diary interface for creating, editing, and browsing journal entries using HTML, CSS, JavaScript, and Bootstrap.</w:t>
       </w:r>
     </w:p>
     <w:p>
@@ -567,7 +657,7 @@
           <w:rFonts w:ascii="Calibri" w:hAnsi="Calibri"/>
           <w:sz w:val="17"/>
         </w:rPr>
-        <w:t>Compared accuracy, precision, recall, and other model metrics to explain practical prediction performance.</w:t>
+        <w:t>Focused on clean frontend structure, smooth browser interactions, reusable UI sections, and a visually attractive user experience.</w:t>
       </w:r>
     </w:p>
     <w:p>

</xml_diff>